<commit_message>
pdf version af samlet hospital bed opgave
</commit_message>
<xml_diff>
--- a/13 Exercises/Exercise - HospitalBed extended edition.docx
+++ b/13 Exercises/Exercise - HospitalBed extended edition.docx
@@ -856,6 +856,7 @@
           <w:bCs/>
           <w:lang w:val="en-US"/>
         </w:rPr>
+        <w:lastRenderedPageBreak/>
         <w:t>Exercise 6:</w:t>
       </w:r>
     </w:p>
@@ -1055,21 +1056,7 @@
         <w:rPr>
           <w:lang w:val="en-US"/>
         </w:rPr>
-        <w:t xml:space="preserve">where the Filter method is called every time, a new sample is read from the sensor. The sample shall be the parameter passed to the method and the method shall return the filtered value. You </w:t>
-      </w:r>
-      <w:proofErr w:type="gramStart"/>
-      <w:r>
-        <w:rPr>
-          <w:lang w:val="en-US"/>
-        </w:rPr>
-        <w:t>have to</w:t>
-      </w:r>
-      <w:proofErr w:type="gramEnd"/>
-      <w:r>
-        <w:rPr>
-          <w:lang w:val="en-US"/>
-        </w:rPr>
-        <w:t xml:space="preserve"> </w:t>
+        <w:t xml:space="preserve">where the Filter method is called every time, a new sample is read from the sensor. The sample shall be the parameter passed to the method and the method shall return the filtered value. You have to </w:t>
       </w:r>
       <w:proofErr w:type="gramStart"/>
       <w:r>
@@ -3739,6 +3726,7 @@
   <w:style w:type="character" w:default="1" w:styleId="DefaultParagraphFont">
     <w:name w:val="Default Paragraph Font"/>
     <w:uiPriority w:val="1"/>
+    <w:semiHidden/>
     <w:unhideWhenUsed/>
   </w:style>
   <w:style w:type="table" w:default="1" w:styleId="TableNormal">

</xml_diff>